<commit_message>
docs: publish CHRITIC-revised lender package (2026-07-06)
Add revised PDFs, markdown-revised sources, and manifest revised block.
Includes Simulation Assumptions Schedule, Key Risks Schedule D, Changes Memo.
</commit_message>
<xml_diff>
--- a/loan/2026-07-06/19-53-22Z/docx/loan-agreement.docx
+++ b/loan/2026-07-06/19-53-22Z/docx/loan-agreement.docx
@@ -617,7 +617,7 @@
         <w:pStyle w:val="BodyText"/>
       </w:pPr>
       <w:r>
-        <w:t xml:space="preserve">See Schedule A for tranche-specific dollar amounts derived from simulation as of 2026-07-06T19:57:10.914Z.</w:t>
+        <w:t xml:space="preserve">See Schedule A for tranche-specific dollar amounts derived from simulation as of 2026-07-06T19:59:10.334Z.</w:t>
       </w:r>
     </w:p>
     <w:bookmarkStart w:id="12" w:name="tranche"/>
@@ -1142,13 +1142,13 @@
       </w:r>
     </w:p>
     <w:bookmarkEnd w:id="19"/>
-    <w:bookmarkStart w:id="22" w:name="Xf2fd09597c47e467217ff704ede7bbb60d2d6ec"/>
+    <w:bookmarkStart w:id="22" w:name="Xbe5bb0b8809162991edec694793f6a717e41027"/>
     <w:p>
       <w:pPr>
         <w:pStyle w:val="Heading2"/>
       </w:pPr>
       <w:r>
-        <w:t xml:space="preserve">Schedule A — Payment amounts (simulation-sized · 2026-07-06T19:57:10.914Z)</w:t>
+        <w:t xml:space="preserve">Schedule A — Payment amounts (simulation-sized · 2026-07-06T19:59:10.334Z)</w:t>
       </w:r>
     </w:p>
     <w:bookmarkStart w:id="20" w:name="tranche-2"/>

</xml_diff>